<commit_message>
Align doc collateral to canonical facts + regenerate
- build_ueba_whitepaper / build_implementation_spec / build_bei_concept_paper:
  8.5%->8.1% FP, "magnitude AND direction" (not direction-instead-of), composite
  4/4 @ 8.1% (cleanly separates 2/4) + Threat-Profile 4/4 @ 0 FP framing.
- Regenerate the .docx/.pptx outputs from the corrected builders.
- APP_REFERENCE.md: add section 9 (doc-collateral canonical rules + the
  50-user/19-week study exception in the Whitepapers analysis docs).

Co-Authored-By: Claude Opus 4.8 (1M context) <noreply@anthropic.com>
</commit_message>
<xml_diff>
--- a/docs/Behavioral_Entity_Intelligence_Framework.docx
+++ b/docs/Behavioral_Entity_Intelligence_Framework.docx
@@ -547,7 +547,7 @@
           <w:color w:val="000000"/>
           <w:sz w:val="21"/>
         </w:rPr>
-        <w:t>Validated through a cybersecurity proof of concept — 250 users, 485 days, 4.2 million daily events, 4 embedded attack campaigns — BEI achieves 4 of 4 attack detection at 8.5% false positive rate, where traditional methods detect 0 of 4 at operationally acceptable thresholds.</w:t>
+        <w:t>Validated through a cybersecurity proof of concept — 250 users, 485 days, 4.2 million daily events, 4 embedded attack campaigns — BEI's multi-front threat-profile detector achieves 4 of 4 attack detection at 0% false positive rate, where traditional methods detect 0 of 4 at operationally acceptable thresholds. Composite scoring alone cleanly separates 2 of 4; the threat-profile detector closes the gap.</w:t>
       </w:r>
     </w:p>
     <w:p>
@@ -564,7 +564,7 @@
           <w:color w:val="0D1B2A"/>
           <w:sz w:val="21"/>
         </w:rPr>
-        <w:t>The entity changes WHAT it does, not HOW MUCH. Traditional analytics measure magnitude. Behavioral Entity Intelligence measures direction.</w:t>
+        <w:t>The entity changes WHAT it does, not HOW MUCH. Traditional analytics measure magnitude alone. Behavioral Entity Intelligence measures magnitude AND direction — accumulated over time, relative to peers.</w:t>
       </w:r>
     </w:p>
     <w:p>
@@ -3847,7 +3847,7 @@
               <w:rPr>
                 <w:sz w:val="18"/>
               </w:rPr>
-              <w:t>4/4 detected at 8.5% FP via multi-phase composite scoring</w:t>
+              <w:t>4/4 detected at 0% FP via the multi-front threat-profile detector (composite scoring alone separates 2/4)</w:t>
             </w:r>
           </w:p>
         </w:tc>
@@ -7629,7 +7629,7 @@
               <w:rPr>
                 <w:sz w:val="18"/>
               </w:rPr>
-              <w:t>4 of 4 detected at 8.5% false positive rate</w:t>
+              <w:t>2 of 4 cleanly separated above the normal population</w:t>
             </w:r>
           </w:p>
         </w:tc>
@@ -7645,7 +7645,7 @@
               <w:rPr>
                 <w:sz w:val="18"/>
               </w:rPr>
-              <w:t>Detection method</w:t>
+              <w:t>BEI threat-profile detector</w:t>
             </w:r>
           </w:p>
         </w:tc>
@@ -7659,9 +7659,37 @@
               <w:rPr>
                 <w:sz w:val="18"/>
               </w:rPr>
-              <w:t>Multi-phase composite: signal strength + breadth + sustained +</w:t>
+              <w:t>4 of 4 detected at 0% false positive rate</w:t>
+            </w:r>
+          </w:p>
+        </w:tc>
+      </w:tr>
+      <w:tr>
+        <w:tc>
+          <w:tcPr>
+            <w:tcW w:type="dxa" w:w="2592"/>
+          </w:tcPr>
+          <w:p>
+            <w:r>
+              <w:rPr>
+                <w:sz w:val="18"/>
+              </w:rPr>
+              <w:t>Detection method</w:t>
+            </w:r>
+          </w:p>
+        </w:tc>
+        <w:tc>
+          <w:tcPr>
+            <w:tcW w:type="dxa" w:w="6912"/>
+          </w:tcPr>
+          <w:p>
+            <w:r>
+              <w:rPr>
+                <w:sz w:val="18"/>
+              </w:rPr>
+              <w:t>Multi-front threat-profile matching: C2-beacon, DGA-DNS,</w:t>
               <w:br/>
-              <w:t>context divergence + novelty persistence</w:t>
+              <w:t>LOTL-process, cohort-rare access, recon-fanout, insider-collection</w:t>
             </w:r>
           </w:p>
         </w:tc>
@@ -7772,7 +7800,7 @@
               </w:rPr>
               <w:t>Composite</w:t>
               <w:br/>
-              <w:t>Score</w:t>
+              <w:t>Rank (/250)</w:t>
             </w:r>
           </w:p>
         </w:tc>
@@ -7791,9 +7819,7 @@
                 <w:color w:val="FFFFFF"/>
                 <w:sz w:val="18"/>
               </w:rPr>
-              <w:t>Rank</w:t>
-              <w:br/>
-              <w:t>(/250)</w:t>
+              <w:t>Caught By</w:t>
             </w:r>
           </w:p>
         </w:tc>
@@ -7868,7 +7894,7 @@
               <w:rPr>
                 <w:sz w:val="18"/>
               </w:rPr>
-              <w:t>51.3</w:t>
+              <w:t>#1 (above norm)</w:t>
             </w:r>
           </w:p>
         </w:tc>
@@ -7881,7 +7907,7 @@
               <w:rPr>
                 <w:sz w:val="18"/>
               </w:rPr>
-              <w:t>#1</w:t>
+              <w:t>Composite</w:t>
             </w:r>
           </w:p>
         </w:tc>
@@ -7956,7 +7982,7 @@
               <w:rPr>
                 <w:sz w:val="18"/>
               </w:rPr>
-              <w:t>46.2</w:t>
+              <w:t>#2 (above norm)</w:t>
             </w:r>
           </w:p>
         </w:tc>
@@ -7970,7 +7996,7 @@
               <w:rPr>
                 <w:sz w:val="18"/>
               </w:rPr>
-              <w:t>#2</w:t>
+              <w:t>Composite</w:t>
             </w:r>
           </w:p>
         </w:tc>
@@ -8042,7 +8068,7 @@
               <w:rPr>
                 <w:sz w:val="18"/>
               </w:rPr>
-              <w:t>19.4</w:t>
+              <w:t>below norm</w:t>
             </w:r>
           </w:p>
         </w:tc>
@@ -8055,7 +8081,7 @@
               <w:rPr>
                 <w:sz w:val="18"/>
               </w:rPr>
-              <w:t>#7</w:t>
+              <w:t>Threat-profile</w:t>
             </w:r>
           </w:p>
         </w:tc>
@@ -8068,9 +8094,9 @@
               <w:rPr>
                 <w:sz w:val="18"/>
               </w:rPr>
-              <w:t>Novelty persistence: C2 beacon IP</w:t>
+              <w:t>C2-beacon front: novel IP recurs with</w:t>
               <w:br/>
-              <w:t>appears in 60/60 post-baseline weeks</w:t>
+              <w:t>beacon cadence in post-baseline weeks</w:t>
             </w:r>
           </w:p>
         </w:tc>
@@ -8130,7 +8156,7 @@
               <w:rPr>
                 <w:sz w:val="18"/>
               </w:rPr>
-              <w:t>13.7</w:t>
+              <w:t>below norm</w:t>
             </w:r>
           </w:p>
         </w:tc>
@@ -8144,7 +8170,7 @@
               <w:rPr>
                 <w:sz w:val="18"/>
               </w:rPr>
-              <w:t>#24</w:t>
+              <w:t>Threat-profile</w:t>
             </w:r>
           </w:p>
         </w:tc>
@@ -8158,9 +8184,9 @@
               <w:rPr>
                 <w:sz w:val="18"/>
               </w:rPr>
-              <w:t>Context divergence + signal strength</w:t>
+              <w:t>LOTL-process front: legitimate tools in</w:t>
               <w:br/>
-              <w:t>from LOTL tool usage patterns</w:t>
+              <w:t>an attacker-shaped usage pattern</w:t>
             </w:r>
           </w:p>
         </w:tc>
@@ -8181,7 +8207,7 @@
           <w:color w:val="0D1B2A"/>
           <w:sz w:val="21"/>
         </w:rPr>
-        <w:t>Traditional anomaly detection (Isolation Forest, SVM, LOF, Z-Score) scores all four attack users as NORMAL — no individual feature exceeds statistical thresholds. BEI's multi-phase composite scoring ranks all four in the top 10% by detecting behavioral direction changes invisible to magnitude-only methods.</w:t>
+        <w:t>Traditional anomaly detection (Isolation Forest, SVM, LOF, Z-Score) scores all four attack users as NORMAL — no individual feature exceeds statistical thresholds. BEI's composite scoring lifts 2 of 4 (USR-156, USR-118) clearly above the normal population; the multi-front threat-profile detector then catches all four at 0% FP by matching attacker-shaped behavior invisible to magnitude-only methods.</w:t>
       </w:r>
     </w:p>
     <w:p>
@@ -8672,7 +8698,7 @@
           <w:color w:val="000000"/>
           <w:sz w:val="21"/>
         </w:rPr>
-        <w:t>The framework is validated through a cybersecurity proof of concept achieving 4 of 4 attack detection at 8.5% false positive rate where traditional methods detect 0 of 4. More importantly, the framework is domain-agnostic — the same analytical architecture that detects insider threats in cybersecurity detects supplier substitution fraud in supply chains, upcoding in healthcare billing, C2 beaconing in APT campaigns, and degradation patterns in equipment maintenance.</w:t>
+        <w:t>The framework is validated through a cybersecurity proof of concept where the multi-front threat-profile detector achieves 4 of 4 attack detection at 0% false positive rate (composite scoring alone separates 2 of 4) while traditional methods detect 0 of 4. More importantly, the framework is domain-agnostic — the same analytical architecture that detects insider threats in cybersecurity detects supplier substitution fraud in supply chains, upcoding in healthcare billing, C2 beaconing in APT campaigns, and degradation patterns in equipment maintenance.</w:t>
       </w:r>
     </w:p>
     <w:p>
@@ -8686,7 +8712,7 @@
           <w:color w:val="000000"/>
           <w:sz w:val="21"/>
         </w:rPr>
-        <w:t>The core insight is universal: sophisticated threats change WHAT they do, not HOW MUCH. They stay within normal volume ranges while shifting behavioral direction. Traditional systems measure magnitude. BEI measures direction. This directional intelligence — applied across entity profiles, relationship dynamics, and network graphs — is the analytical foundation required to detect the threats that matter most.</w:t>
+        <w:t>The core insight is universal: sophisticated threats change WHAT they do, not HOW MUCH. They stay within normal volume ranges while shifting behavioral direction. Traditional systems measure magnitude alone. BEI measures magnitude AND direction — accumulated over time, relative to peers. This directional intelligence — applied across entity profiles, relationship dynamics, and network graphs — is the analytical foundation required to detect the threats that matter most.</w:t>
       </w:r>
     </w:p>
     <w:p>

</xml_diff>